<commit_message>
Separate technical demo, patient walkthrough and team recording scripts
</commit_message>
<xml_diff>
--- a/submission/SELF_RECORDING_GUIDE.docx
+++ b/submission/SELF_RECORDING_GUIDE.docx
@@ -7,7 +7,7 @@
         <w:pStyle w:val="Title"/>
       </w:pPr>
       <w:r>
-        <w:t xml:space="preserve">RareBridge — record your own walkthrough and technical demo</w:t>
+        <w:t xml:space="preserve">RareBridge — three separate recordings: walkthrough, technical demo and team video</w:t>
       </w:r>
     </w:p>
     <w:p>
@@ -30,7 +30,7 @@
         <w:pStyle w:val="Heading1"/>
       </w:pPr>
       <w:r>
-        <w:t xml:space="preserve">RECORD TWO DIFFERENT VIDEOS</w:t>
+        <w:t xml:space="preserve">RECORD THREE SEPARATE VIDEOS</w:t>
       </w:r>
     </w:p>
     <w:p>
@@ -60,12 +60,57 @@
     </w:p>
     <w:p>
       <w:r>
-        <w:t xml:space="preserve">   portal. If it wants a team video, include the short team introduction below;</w:t>
-      </w:r>
-    </w:p>
-    <w:p>
-      <w:r>
-        <w:t xml:space="preserve">   do not assume a technical demo replaces every required submission artifact.</w:t>
+        <w:t xml:space="preserve">   portal. Submit this as its own recording, separately from the walkthrough</w:t>
+      </w:r>
+    </w:p>
+    <w:p>
+      <w:r>
+        <w:t xml:space="preserve">   and team video. Standalone script: TECHNICAL_DEMO_SCRIPT.txt/.docx.</w:t>
+      </w:r>
+    </w:p>
+    <w:p>
+      <w:r>
+        <w:t xml:space="preserve">3. Team video: suggested 60–90 seconds, unless the portal specifies otherwise.</w:t>
+      </w:r>
+    </w:p>
+    <w:p>
+      <w:r>
+        <w:t xml:space="preserve">   Introduce all four people, their actual contributions, the problem, USP and</w:t>
+      </w:r>
+    </w:p>
+    <w:p>
+      <w:r>
+        <w:t xml:space="preserve">   next validation. Standalone script: TEAM_SELF_RECORDING_SCRIPT.txt/.docx.</w:t>
+      </w:r>
+    </w:p>
+    <w:p>
+      <w:r>
+        <w:t xml:space="preserve"/>
+      </w:r>
+    </w:p>
+    <w:p>
+      <w:r>
+        <w:t xml:space="preserve">The supplied PS lists the working prototype, source repository, team video and</w:t>
+      </w:r>
+    </w:p>
+    <w:p>
+      <w:r>
+        <w:t xml:space="preserve">one-minute walkthrough on page 6. You have reported a separate technical-demo</w:t>
+      </w:r>
+    </w:p>
+    <w:p>
+      <w:r>
+        <w:t xml:space="preserve">deliverable in the submission flow, so keep its recording separate too. Include</w:t>
+      </w:r>
+    </w:p>
+    <w:p>
+      <w:r>
+        <w:t xml:space="preserve">the public app and source URLs wherever the technical-demo field permits them.</w:t>
+      </w:r>
+    </w:p>
+    <w:p>
+      <w:r>
+        <w:t xml:space="preserve">None of our suggested durations overrides a portal limit.</w:t>
       </w:r>
     </w:p>
     <w:p>
@@ -586,7 +631,7 @@
         <w:pStyle w:val="Heading1"/>
       </w:pPr>
       <w:r>
-        <w:t xml:space="preserve">VIDEO 2 — THE TECHNICAL DEMO / TEAM PRODUCT EXPLANATION</w:t>
+        <w:t xml:space="preserve">VIDEO 2 — THE SEPARATE TECHNICAL DEMO</w:t>
       </w:r>
     </w:p>
     <w:p>
@@ -606,6 +651,11 @@
     </w:p>
     <w:p>
       <w:r>
+        <w:t xml:space="preserve">The separate team video has its own script; this demo proves how the system works.</w:t>
+      </w:r>
+    </w:p>
+    <w:p>
+      <w:r>
         <w:t xml:space="preserve"/>
       </w:r>
     </w:p>
@@ -1173,12 +1223,12 @@
         <w:pStyle w:val="Heading2"/>
       </w:pPr>
       <w:r>
-        <w:t xml:space="preserve">3:45–4:00 | TEAM AND CLOSING</w:t>
-      </w:r>
-    </w:p>
-    <w:p>
-      <w:r>
-        <w:t xml:space="preserve">SHOW: the live collaboration brief or a simple credit slide with actual names.</w:t>
+        <w:t xml:space="preserve">3:45–4:00 | TECHNICAL RESULT AND CLOSING</w:t>
+      </w:r>
+    </w:p>
+    <w:p>
+      <w:r>
+        <w:t xml:space="preserve">SHOW: the actual exported brief and the public app/source URLs.</w:t>
       </w:r>
     </w:p>
     <w:p>
@@ -1188,27 +1238,22 @@
     </w:p>
     <w:p>
       <w:r>
-        <w:t xml:space="preserve">  "Atharva handled AI, integration and deployment; Srinath contributed backend</w:t>
-      </w:r>
-    </w:p>
-    <w:p>
-      <w:r>
-        <w:t xml:space="preserve">  and frontend; Saanvi handled evidence; Dhruv handled evaluation. RareBridge's</w:t>
-      </w:r>
-    </w:p>
-    <w:p>
-      <w:r>
-        <w:t xml:space="preserve">  contribution is the journey from a possible connection to a resource-specific</w:t>
-      </w:r>
-    </w:p>
-    <w:p>
-      <w:r>
-        <w:t xml:space="preserve">  check and a sourced question for the right research partner."</w:t>
-      </w:r>
-    </w:p>
-    <w:p>
-      <w:r>
-        <w:t xml:space="preserve">Adjust credits if a teammate's actual contribution differs.</w:t>
+        <w:t xml:space="preserve">  "This is the technical result: a source-inspectable assessment and an exported</w:t>
+      </w:r>
+    </w:p>
+    <w:p>
+      <w:r>
+        <w:t xml:space="preserve">  brief that preserves the current checks, evidence gaps and next questions.</w:t>
+      </w:r>
+    </w:p>
+    <w:p>
+      <w:r>
+        <w:t xml:space="preserve">  Judges can use the public app and reproduce the dataset and application from</w:t>
+      </w:r>
+    </w:p>
+    <w:p>
+      <w:r>
+        <w:t xml:space="preserve">  the repository. Expert validation and impact measurement are the next steps."</w:t>
       </w:r>
     </w:p>
     <w:p>

</xml_diff>